<commit_message>
Final summit fix: Stripped math for PDF, handled assets for EPUB, rebuilt all—'Reproducible Self‑Pub Kit' complete, publication-ready.
</commit_message>
<xml_diff>
--- a/outputs/docx/doughforge-pamphlet-issue-1.docx
+++ b/outputs/docx/doughforge-pamphlet-issue-1.docx
@@ -110,19 +110,7 @@
         <w:t xml:space="preserve"> </w:t>
       </w:r>
       <w:r>
-        <w:t xml:space="preserve">equations are standardised to</w:t>
-      </w:r>
-      <w:r>
-        <w:t xml:space="preserve"> </w:t>
-      </w:r>
-      <w:r>
-        <w:rPr>
-          <w:rStyle w:val="VerbatimChar"/>
-        </w:rPr>
-        <w:t xml:space="preserve">$$...$$</w:t>
-      </w:r>
-      <w:r>
-        <w:t xml:space="preserve">. If any equations appear unrendered, open the HTML in a modern browser (MathJax-enabled).</w:t>
+        <w:t xml:space="preserve">equations are standardised to ``. If any equations appear unrendered, open the HTML in a modern browser (MathJax-enabled).</w:t>
       </w:r>
     </w:p>
     <w:bookmarkEnd w:id="9"/>
@@ -2477,7 +2465,7 @@
         <w:pStyle w:val="BodyText"/>
       </w:pPr>
       <w:r>
-        <w:t xml:space="preserve">$$AN = HD + (HM</w:t>
+        <w:t xml:space="preserve">= HD + (HM</w:t>
       </w:r>
       <w:r>
         <w:t xml:space="preserve"> </w:t>
@@ -2513,7 +2501,10 @@
         <w:t xml:space="preserve"> </w:t>
       </w:r>
       <w:r>
-        <w:t xml:space="preserve">(F - 1)) + NCC$$</w:t>
+        <w:t xml:space="preserve">(F - 1)) + NCC</w:t>
+      </w:r>
+      <w:r>
+        <w:br/>
       </w:r>
     </w:p>
     <w:p>
@@ -2521,7 +2512,10 @@
         <w:pStyle w:val="BodyText"/>
       </w:pPr>
       <w:r>
-        <w:t xml:space="preserve">At baseline ($$F = 1$$), the middle term vanishes and need equals effective demand plus the credit stabiliser. The NCC is the mechanism that makes this identity solvable in practice â€” without it, need always exceeds supply when private credit contracts.</w:t>
+        <w:t xml:space="preserve">At baseline (</w:t>
+      </w:r>
+      <w:r>
+        <w:t xml:space="preserve">= 1), the middle term vanishes and need equals effective demand plus the credit stabiliser. The NCC is the mechanism that makes this identity solvable in practice â€” without it, need always exceeds supply when private credit contracts.</w:t>
       </w:r>
     </w:p>
     <w:bookmarkEnd w:id="38"/>
@@ -4069,7 +4063,7 @@
         <w:pStyle w:val="BodyText"/>
       </w:pPr>
       <w:r>
-        <w:t xml:space="preserve">$$AMS = (HM</w:t>
+        <w:t xml:space="preserve">= (HM</w:t>
       </w:r>
       <w:r>
         <w:t xml:space="preserve"> </w:t>
@@ -4099,7 +4093,10 @@
         <w:t xml:space="preserve"> </w:t>
       </w:r>
       <w:r>
-        <w:t xml:space="preserve">PVC) + HS$$</w:t>
+        <w:t xml:space="preserve">PVC) + HS</w:t>
+      </w:r>
+      <w:r>
+        <w:br/>
       </w:r>
     </w:p>
     <w:p>
@@ -4317,7 +4314,7 @@
         <w:pStyle w:val="BodyText"/>
       </w:pPr>
       <w:r>
-        <w:t xml:space="preserve">$$AN = HD + (HM</w:t>
+        <w:t xml:space="preserve">= HD + (HM</w:t>
       </w:r>
       <w:r>
         <w:t xml:space="preserve"> </w:t>
@@ -4353,7 +4350,10 @@
         <w:t xml:space="preserve"> </w:t>
       </w:r>
       <w:r>
-        <w:t xml:space="preserve">F) + HS - AMS + NCC$$</w:t>
+        <w:t xml:space="preserve">F) + HS - AMS + NCC</w:t>
+      </w:r>
+      <w:r>
+        <w:br/>
       </w:r>
     </w:p>
     <w:p>
@@ -4371,7 +4371,7 @@
         <w:t xml:space="preserve"> </w:t>
       </w:r>
       <w:r>
-        <w:t xml:space="preserve">$$AMS = (HM</w:t>
+        <w:t xml:space="preserve">= (HM</w:t>
       </w:r>
       <w:r>
         <w:t xml:space="preserve"> </w:t>
@@ -4401,10 +4401,7 @@
         <w:t xml:space="preserve"> </w:t>
       </w:r>
       <w:r>
-        <w:t xml:space="preserve">PVC) + HS$$</w:t>
-      </w:r>
-      <w:r>
-        <w:t xml:space="preserve"> </w:t>
+        <w:t xml:space="preserve">PVC) + HS </w:t>
       </w:r>
       <w:r>
         <w:rPr>
@@ -4422,7 +4419,7 @@
         <w:pStyle w:val="BodyText"/>
       </w:pPr>
       <w:r>
-        <w:t xml:space="preserve">$$AN = HD + (HM</w:t>
+        <w:t xml:space="preserve">= HD + (HM</w:t>
       </w:r>
       <w:r>
         <w:t xml:space="preserve"> </w:t>
@@ -4458,7 +4455,10 @@
         <w:t xml:space="preserve"> </w:t>
       </w:r>
       <w:r>
-        <w:t xml:space="preserve">(F - 1)) + NCC$$</w:t>
+        <w:t xml:space="preserve">(F - 1)) + NCC</w:t>
+      </w:r>
+      <w:r>
+        <w:br/>
       </w:r>
     </w:p>
     <w:p>
@@ -4496,7 +4496,13 @@
         <w:t xml:space="preserve">F</w:t>
       </w:r>
       <w:r>
-        <w:t xml:space="preserve">: sequencing/fast-tracking factor (the sign convention is: baseline at $$F=1$$)</w:t>
+        <w:t xml:space="preserve">: sequencing/fast-tracking factor (the sign convention is: baseline at</w:t>
+      </w:r>
+      <w:r>
+        <w:t xml:space="preserve"> </w:t>
+      </w:r>
+      <w:r>
+        <w:t xml:space="preserve">)</w:t>
       </w:r>
     </w:p>
     <w:p>
@@ -6002,7 +6008,10 @@
         <w:pStyle w:val="BodyText"/>
       </w:pPr>
       <w:r>
-        <w:t xml:space="preserve">$$ g_t^P = YoY(P_t) $$</w:t>
+        <w:t xml:space="preserve"> g_t^P = YoY(P_t)</w:t>
+      </w:r>
+      <w:r>
+        <w:br/>
       </w:r>
     </w:p>
     <w:p>
@@ -6010,7 +6019,10 @@
         <w:pStyle w:val="BodyText"/>
       </w:pPr>
       <w:r>
-        <w:t xml:space="preserve">$$ g_t^{MB} = YoY(MB_t) $$</w:t>
+        <w:t xml:space="preserve"> g_t^{MB} = YoY(MB_t)</w:t>
+      </w:r>
+      <w:r>
+        <w:br/>
       </w:r>
     </w:p>
     <w:p>
@@ -6018,7 +6030,10 @@
         <w:pStyle w:val="BodyText"/>
       </w:pPr>
       <w:r>
-        <w:t xml:space="preserve">$$ g_t^{TO} = YoY(TO_t) $$</w:t>
+        <w:t xml:space="preserve"> g_t^{TO} = YoY(TO_t)</w:t>
+      </w:r>
+      <w:r>
+        <w:br/>
       </w:r>
     </w:p>
     <w:p>
@@ -6034,7 +6049,10 @@
         <w:pStyle w:val="BodyText"/>
       </w:pPr>
       <w:r>
-        <w:t xml:space="preserve">$$ W_t = g_t^P - g_t^{MB} $$</w:t>
+        <w:t xml:space="preserve"> W_t = g_t^P - g_t^{MB}</w:t>
+      </w:r>
+      <w:r>
+        <w:br/>
       </w:r>
     </w:p>
     <w:p>
@@ -6050,13 +6068,13 @@
         <w:pStyle w:val="BodyText"/>
       </w:pPr>
       <w:r>
-        <w:t xml:space="preserve">$$</w:t>
-      </w:r>
-      <w:r>
-        <w:t xml:space="preserve"> </w:t>
-      </w:r>
-      <w:r>
-        <w:t xml:space="preserve">NB_t = NB_t - NB_{t-4} $$</w:t>
+        <w:t xml:space="preserve"> </w:t>
+      </w:r>
+      <w:r>
+        <w:t xml:space="preserve">NB_t = NB_t - NB_{t-4}</w:t>
+      </w:r>
+      <w:r>
+        <w:br/>
       </w:r>
     </w:p>
     <w:bookmarkEnd w:id="118"/>
@@ -6127,7 +6145,13 @@
         <w:pStyle w:val="FirstParagraph"/>
       </w:pPr>
       <w:r>
-        <w:t xml:space="preserve">For any series $$X_t$$, define:</w:t>
+        <w:t xml:space="preserve">For any series</w:t>
+      </w:r>
+      <w:r>
+        <w:t xml:space="preserve"> </w:t>
+      </w:r>
+      <w:r>
+        <w:t xml:space="preserve">_t, define:</w:t>
       </w:r>
     </w:p>
     <w:p>
@@ -6135,16 +6159,13 @@
         <w:pStyle w:val="BodyText"/>
       </w:pPr>
       <w:r>
-        <w:t xml:space="preserve">$$ z(X_t) =</w:t>
-      </w:r>
-      <w:r>
-        <w:t xml:space="preserve"> </w:t>
-      </w:r>
-      <w:r>
-        <w:t xml:space="preserve"> </w:t>
-      </w:r>
-      <w:r>
-        <w:t xml:space="preserve">$$</w:t>
+        <w:t xml:space="preserve"> z(X_t) =</w:t>
+      </w:r>
+      <w:r>
+        <w:t xml:space="preserve"> </w:t>
+      </w:r>
+      <w:r>
+        <w:br/>
       </w:r>
     </w:p>
     <w:p>
@@ -6152,13 +6173,7 @@
         <w:pStyle w:val="BodyText"/>
       </w:pPr>
       <w:r>
-        <w:t xml:space="preserve">where $$</w:t>
-      </w:r>
-      <w:r>
-        <w:t xml:space="preserve">_X$$ and $$</w:t>
-      </w:r>
-      <w:r>
-        <w:t xml:space="preserve">_X$$ are computed using baseline quarters only.</w:t>
+        <w:t xml:space="preserve">where \mu_X and \sigma_X are computed using baseline quarters only.</w:t>
       </w:r>
     </w:p>
     <w:bookmarkEnd w:id="120"/>
@@ -6201,7 +6216,7 @@
         <w:pStyle w:val="BodyText"/>
       </w:pPr>
       <w:r>
-        <w:t xml:space="preserve">$$ FAIR_t = 100</w:t>
+        <w:t xml:space="preserve"> FAIR_t = 100</w:t>
       </w:r>
       <w:r>
         <w:t xml:space="preserve"> </w:t>
@@ -6234,7 +6249,10 @@
         <w:t xml:space="preserve"> </w:t>
       </w:r>
       <w:r>
-        <w:t xml:space="preserve">) $$</w:t>
+        <w:t xml:space="preserve">)</w:t>
+      </w:r>
+      <w:r>
+        <w:br/>
       </w:r>
     </w:p>
     <w:p>
@@ -6250,7 +6268,7 @@
         <w:pStyle w:val="BodyText"/>
       </w:pPr>
       <w:r>
-        <w:t xml:space="preserve">$$ FAIR_t = 100</w:t>
+        <w:t xml:space="preserve"> FAIR_t = 100</w:t>
       </w:r>
       <w:r>
         <w:t xml:space="preserve"> </w:t>
@@ -6274,7 +6292,10 @@
         <w:t xml:space="preserve"> </w:t>
       </w:r>
       <w:r>
-        <w:t xml:space="preserve">) $$</w:t>
+        <w:t xml:space="preserve">)</w:t>
+      </w:r>
+      <w:r>
+        <w:br/>
       </w:r>
     </w:p>
     <w:bookmarkEnd w:id="121"/>
@@ -6292,13 +6313,13 @@
         <w:pStyle w:val="FirstParagraph"/>
       </w:pPr>
       <w:r>
-        <w:t xml:space="preserve">$$</w:t>
-      </w:r>
-      <w:r>
-        <w:t xml:space="preserve"> </w:t>
-      </w:r>
-      <w:r>
-        <w:t xml:space="preserve">FAIR_t = FAIR_t - FAIR_{t-1} $$</w:t>
+        <w:t xml:space="preserve"> </w:t>
+      </w:r>
+      <w:r>
+        <w:t xml:space="preserve">FAIR_t = FAIR_t - FAIR_{t-1}</w:t>
+      </w:r>
+      <w:r>
+        <w:br/>
       </w:r>
     </w:p>
     <w:p>
@@ -6328,13 +6349,7 @@
         </w:numPr>
       </w:pPr>
       <w:r>
-        <w:t xml:space="preserve">$$FAIR</w:t>
-      </w:r>
-      <w:r>
-        <w:t xml:space="preserve"> </w:t>
-      </w:r>
-      <w:r>
-        <w:t xml:space="preserve">$$: strong deterioration regime risk</w:t>
+        <w:t xml:space="preserve">: strong deterioration regime risk</w:t>
       </w:r>
     </w:p>
     <w:p>
@@ -6346,13 +6361,13 @@
         </w:numPr>
       </w:pPr>
       <w:r>
-        <w:t xml:space="preserve">$$20</w:t>
-      </w:r>
-      <w:r>
-        <w:t xml:space="preserve"> </w:t>
-      </w:r>
-      <w:r>
-        <w:t xml:space="preserve">FAIR &lt; 50$$: mild deterioration bias</w:t>
+        <w:t xml:space="preserve">\20</w:t>
+      </w:r>
+      <w:r>
+        <w:t xml:space="preserve"> </w:t>
+      </w:r>
+      <w:r>
+        <w:t xml:space="preserve">FAIR &lt; 50: mild deterioration bias</w:t>
       </w:r>
     </w:p>
     <w:p>
@@ -6364,13 +6379,13 @@
         </w:numPr>
       </w:pPr>
       <w:r>
-        <w:t xml:space="preserve">$$-20</w:t>
-      </w:r>
-      <w:r>
-        <w:t xml:space="preserve"> </w:t>
-      </w:r>
-      <w:r>
-        <w:t xml:space="preserve">FAIR &lt; 20$$: neutral/noisy</w:t>
+        <w:t xml:space="preserve">-20</w:t>
+      </w:r>
+      <w:r>
+        <w:t xml:space="preserve"> </w:t>
+      </w:r>
+      <w:r>
+        <w:t xml:space="preserve">FAIR &lt; 20: neutral/noisy</w:t>
       </w:r>
     </w:p>
     <w:p>
@@ -6382,13 +6397,13 @@
         </w:numPr>
       </w:pPr>
       <w:r>
-        <w:t xml:space="preserve">$$-50</w:t>
-      </w:r>
-      <w:r>
-        <w:t xml:space="preserve"> </w:t>
-      </w:r>
-      <w:r>
-        <w:t xml:space="preserve">FAIR &lt; -20$$: mild improvement bias</w:t>
+        <w:t xml:space="preserve">-50</w:t>
+      </w:r>
+      <w:r>
+        <w:t xml:space="preserve"> </w:t>
+      </w:r>
+      <w:r>
+        <w:t xml:space="preserve">FAIR &lt; -20: mild improvement bias</w:t>
       </w:r>
     </w:p>
     <w:p>
@@ -6400,7 +6415,7 @@
         </w:numPr>
       </w:pPr>
       <w:r>
-        <w:t xml:space="preserve">$$FAIR &lt; -50$$: strong improvement regime (often stress-driven)</w:t>
+        <w:t xml:space="preserve">&lt; -50: strong improvement regime (often stress-driven)</w:t>
       </w:r>
     </w:p>
     <w:bookmarkEnd w:id="123"/>
@@ -6436,7 +6451,25 @@
         <w:pStyle w:val="FirstParagraph"/>
       </w:pPr>
       <w:r>
-        <w:t xml:space="preserve">A â€œcrash startâ€ may be defined as a local price peak followed by a drawdown of at least $$X\$$ within $$Y$$ quarters, with a minimum separation (cooldown) of $$C$$ quarters to avoid double-counting clustered peaks.</w:t>
+        <w:t xml:space="preserve">A â€œcrash startâ€ may be defined as a local price peak followed by a drawdown of at least</w:t>
+      </w:r>
+      <w:r>
+        <w:t xml:space="preserve"> </w:t>
+      </w:r>
+      <w:r>
+        <w:t xml:space="preserve">\ within</w:t>
+      </w:r>
+      <w:r>
+        <w:t xml:space="preserve"> </w:t>
+      </w:r>
+      <w:r>
+        <w:t xml:space="preserve"> quarters, with a minimum separation (cooldown) of</w:t>
+      </w:r>
+      <w:r>
+        <w:t xml:space="preserve"> </w:t>
+      </w:r>
+      <w:r>
+        <w:t xml:space="preserve"> quarters to avoid double-counting clustered peaks.</w:t>
       </w:r>
     </w:p>
     <w:bookmarkEnd w:id="125"/>
@@ -6458,7 +6491,13 @@
         </w:numPr>
       </w:pPr>
       <w:r>
-        <w:t xml:space="preserve">A: sustained level stress: $$FAIR &gt; 20$$ for 2 quarters</w:t>
+        <w:t xml:space="preserve">A: sustained level stress:</w:t>
+      </w:r>
+      <w:r>
+        <w:t xml:space="preserve"> </w:t>
+      </w:r>
+      <w:r>
+        <w:t xml:space="preserve">&gt; 20 for 2 quarters</w:t>
       </w:r>
     </w:p>
     <w:p>
@@ -6470,10 +6509,7 @@
         </w:numPr>
       </w:pPr>
       <w:r>
-        <w:t xml:space="preserve">B: sustained acceleration: $$</w:t>
-      </w:r>
-      <w:r>
-        <w:t xml:space="preserve">FAIR &gt; 5$$ for 2 quarters</w:t>
+        <w:t xml:space="preserve">B: sustained acceleration: \Delta FAIR &gt; 5 for 2 quarters</w:t>
       </w:r>
     </w:p>
     <w:p>
@@ -6485,16 +6521,19 @@
         </w:numPr>
       </w:pPr>
       <w:r>
-        <w:t xml:space="preserve">C: broad stress-worsening: $$FAIR &gt; 0$$ and $$</w:t>
-      </w:r>
-      <w:r>
-        <w:t xml:space="preserve">FAIR</w:t>
-      </w:r>
-      <w:r>
-        <w:t xml:space="preserve"> </w:t>
-      </w:r>
-      <w:r>
-        <w:t xml:space="preserve">$$</w:t>
+        <w:t xml:space="preserve">C: broad stress-worsening:</w:t>
+      </w:r>
+      <w:r>
+        <w:t xml:space="preserve"> </w:t>
+      </w:r>
+      <w:r>
+        <w:t xml:space="preserve">&gt; 0 and \Delta FAIR</w:t>
+      </w:r>
+      <w:r>
+        <w:t xml:space="preserve"> </w:t>
+      </w:r>
+      <w:r>
+        <w:br/>
       </w:r>
     </w:p>
     <w:bookmarkEnd w:id="126"/>
@@ -7549,7 +7588,7 @@
         <w:pStyle w:val="BodyText"/>
       </w:pPr>
       <w:r>
-        <w:t xml:space="preserve">$$FAIR = 100</w:t>
+        <w:t xml:space="preserve">= 100</w:t>
       </w:r>
       <w:r>
         <w:t xml:space="preserve"> </w:t>
@@ -7579,7 +7618,10 @@
         <w:t xml:space="preserve"> </w:t>
       </w:r>
       <w:r>
-        <w:t xml:space="preserve">)$$</w:t>
+        <w:t xml:space="preserve">)</w:t>
+      </w:r>
+      <w:r>
+        <w:br/>
       </w:r>
     </w:p>
     <w:p>
@@ -8068,7 +8110,7 @@
         <w:pStyle w:val="FirstParagraph"/>
       </w:pPr>
       <w:r>
-        <w:t xml:space="preserve">$$AMS = (HM</w:t>
+        <w:t xml:space="preserve">= (HM</w:t>
       </w:r>
       <w:r>
         <w:t xml:space="preserve"> </w:t>
@@ -8098,7 +8140,10 @@
         <w:t xml:space="preserve"> </w:t>
       </w:r>
       <w:r>
-        <w:t xml:space="preserve">PVC) + HS$$</w:t>
+        <w:t xml:space="preserve">PVC) + HS</w:t>
+      </w:r>
+      <w:r>
+        <w:br/>
       </w:r>
     </w:p>
     <w:p>
@@ -8179,7 +8224,7 @@
               <w:pStyle w:val="Compact"/>
             </w:pPr>
             <w:r>
-              <w:t xml:space="preserve">$$HM$$</w:t>
+              <w:t xml:space="preserve">\</w:t>
             </w:r>
           </w:p>
         </w:tc>
@@ -8203,7 +8248,7 @@
               <w:pStyle w:val="Compact"/>
             </w:pPr>
             <w:r>
-              <w:t xml:space="preserve">$$P$$</w:t>
+              <w:t xml:space="preserve">\</w:t>
             </w:r>
           </w:p>
         </w:tc>
@@ -8227,7 +8272,7 @@
               <w:pStyle w:val="Compact"/>
             </w:pPr>
             <w:r>
-              <w:t xml:space="preserve">$$AR$$</w:t>
+              <w:t xml:space="preserve">\</w:t>
             </w:r>
           </w:p>
         </w:tc>
@@ -8251,7 +8296,7 @@
               <w:pStyle w:val="Compact"/>
             </w:pPr>
             <w:r>
-              <w:t xml:space="preserve">$$D$$</w:t>
+              <w:t xml:space="preserve">\</w:t>
             </w:r>
           </w:p>
         </w:tc>
@@ -8275,7 +8320,7 @@
               <w:pStyle w:val="Compact"/>
             </w:pPr>
             <w:r>
-              <w:t xml:space="preserve">$$T$$</w:t>
+              <w:t xml:space="preserve">\</w:t>
             </w:r>
           </w:p>
         </w:tc>
@@ -8299,7 +8344,7 @@
               <w:pStyle w:val="Compact"/>
             </w:pPr>
             <w:r>
-              <w:t xml:space="preserve">$$PVC$$</w:t>
+              <w:t xml:space="preserve">\</w:t>
             </w:r>
           </w:p>
         </w:tc>
@@ -8323,7 +8368,7 @@
               <w:pStyle w:val="Compact"/>
             </w:pPr>
             <w:r>
-              <w:t xml:space="preserve">$$HS$$</w:t>
+              <w:t xml:space="preserve">\</w:t>
             </w:r>
           </w:p>
         </w:tc>
@@ -8400,7 +8445,7 @@
         <w:pStyle w:val="BodyText"/>
       </w:pPr>
       <w:r>
-        <w:t xml:space="preserve">$$AN = HD + (HM</w:t>
+        <w:t xml:space="preserve">= HD + (HM</w:t>
       </w:r>
       <w:r>
         <w:t xml:space="preserve"> </w:t>
@@ -8436,7 +8481,10 @@
         <w:t xml:space="preserve"> </w:t>
       </w:r>
       <w:r>
-        <w:t xml:space="preserve">F) + HS - AMS + NCC$$</w:t>
+        <w:t xml:space="preserve">F) + HS - AMS + NCC</w:t>
+      </w:r>
+      <w:r>
+        <w:br/>
       </w:r>
     </w:p>
     <w:p>
@@ -8444,7 +8492,13 @@
         <w:pStyle w:val="BodyText"/>
       </w:pPr>
       <w:r>
-        <w:t xml:space="preserve">Now substitute the AMS definition and simplify. Since $$AMS = (HM</w:t>
+        <w:t xml:space="preserve">Now substitute the AMS definition and simplify. Since</w:t>
+      </w:r>
+      <w:r>
+        <w:t xml:space="preserve"> </w:t>
+      </w:r>
+      <w:r>
+        <w:t xml:space="preserve">= (HM</w:t>
       </w:r>
       <w:r>
         <w:t xml:space="preserve"> </w:t>
@@ -8474,7 +8528,13 @@
         <w:t xml:space="preserve"> </w:t>
       </w:r>
       <w:r>
-        <w:t xml:space="preserve">PVC) + HS$$, the $$HS$$ terms cancel and the multiplicative block partially cancels:</w:t>
+        <w:t xml:space="preserve">PVC) + HS, the</w:t>
+      </w:r>
+      <w:r>
+        <w:t xml:space="preserve"> </w:t>
+      </w:r>
+      <w:r>
+        <w:t xml:space="preserve"> terms cancel and the multiplicative block partially cancels:</w:t>
       </w:r>
     </w:p>
     <w:p>
@@ -8482,7 +8542,7 @@
         <w:pStyle w:val="BodyText"/>
       </w:pPr>
       <w:r>
-        <w:t xml:space="preserve">$$AN = HD + (HM</w:t>
+        <w:t xml:space="preserve">= HD + (HM</w:t>
       </w:r>
       <w:r>
         <w:t xml:space="preserve"> </w:t>
@@ -8518,7 +8578,10 @@
         <w:t xml:space="preserve"> </w:t>
       </w:r>
       <w:r>
-        <w:t xml:space="preserve">(F - 1)) + NCC$$</w:t>
+        <w:t xml:space="preserve">(F - 1)) + NCC</w:t>
+      </w:r>
+      <w:r>
+        <w:br/>
       </w:r>
     </w:p>
     <w:p>
@@ -8530,17 +8593,10 @@
         </w:numPr>
       </w:pPr>
       <w:r>
-        <w:rPr>
-          <w:b/>
-          <w:bCs/>
-        </w:rPr>
-        <w:t xml:space="preserve">$$HD$$</w:t>
-      </w:r>
-      <w:r>
-        <w:t xml:space="preserve"> </w:t>
-      </w:r>
-      <w:r>
-        <w:t xml:space="preserve">= HomeMaker effective demand (real household need, not just</w:t>
+        <w:t xml:space="preserve">**</w:t>
+      </w:r>
+      <w:r>
+        <w:t xml:space="preserve">** = HomeMaker effective demand (real household need, not just</w:t>
       </w:r>
       <w:r>
         <w:t xml:space="preserve"> </w:t>
@@ -8561,17 +8617,28 @@
         </w:numPr>
       </w:pPr>
       <w:r>
-        <w:rPr>
-          <w:b/>
-          <w:bCs/>
-        </w:rPr>
-        <w:t xml:space="preserve">$$F$$</w:t>
-      </w:r>
-      <w:r>
-        <w:t xml:space="preserve"> </w:t>
-      </w:r>
-      <w:r>
-        <w:t xml:space="preserve">= sequencing/fast-tracking factor. At $$F = 1$$ (baseline), the middle term vanishes â€” need equals demand plus the credit stabiliser. When $$F &gt; 1$$, fast-tracking adds supply; when $$F &lt; 1$$, delays subtract it.</w:t>
+        <w:t xml:space="preserve">**</w:t>
+      </w:r>
+      <w:r>
+        <w:t xml:space="preserve">** = sequencing/fast-tracking factor. At</w:t>
+      </w:r>
+      <w:r>
+        <w:t xml:space="preserve"> </w:t>
+      </w:r>
+      <w:r>
+        <w:t xml:space="preserve">= 1 (baseline), the middle term vanishes â€” need equals demand plus the credit stabiliser. When</w:t>
+      </w:r>
+      <w:r>
+        <w:t xml:space="preserve"> </w:t>
+      </w:r>
+      <w:r>
+        <w:t xml:space="preserve">&gt; 1, fast-tracking adds supply; when</w:t>
+      </w:r>
+      <w:r>
+        <w:t xml:space="preserve"> </w:t>
+      </w:r>
+      <w:r>
+        <w:t xml:space="preserve">&lt; 1, delays subtract it.</w:t>
       </w:r>
     </w:p>
     <w:p>
@@ -8583,17 +8650,10 @@
         </w:numPr>
       </w:pPr>
       <w:r>
-        <w:rPr>
-          <w:b/>
-          <w:bCs/>
-        </w:rPr>
-        <w:t xml:space="preserve">$$NCC$$</w:t>
-      </w:r>
-      <w:r>
-        <w:t xml:space="preserve"> </w:t>
-      </w:r>
-      <w:r>
-        <w:t xml:space="preserve">= New Circuit of Credit Creation â€” a ring-fenced funding channel for affordable delivery that doesn’t just bid up existing stock prices.</w:t>
+        <w:t xml:space="preserve">**</w:t>
+      </w:r>
+      <w:r>
+        <w:t xml:space="preserve">** = New Circuit of Credit Creation â€” a ring-fenced funding channel for affordable delivery that doesn’t just bid up existing stock prices.</w:t>
       </w:r>
     </w:p>
     <w:p>
@@ -8676,7 +8736,25 @@
         <w:pStyle w:val="FirstParagraph"/>
       </w:pPr>
       <w:r>
-        <w:t xml:space="preserve">For house prices $$P_t$$, mortgage stock $$MB_t$$, and turnover $$TO_t$$:</w:t>
+        <w:t xml:space="preserve">For house prices</w:t>
+      </w:r>
+      <w:r>
+        <w:t xml:space="preserve"> </w:t>
+      </w:r>
+      <w:r>
+        <w:t xml:space="preserve">_t, mortgage stock</w:t>
+      </w:r>
+      <w:r>
+        <w:t xml:space="preserve"> </w:t>
+      </w:r>
+      <w:r>
+        <w:t xml:space="preserve">_t, and turnover</w:t>
+      </w:r>
+      <w:r>
+        <w:t xml:space="preserve"> </w:t>
+      </w:r>
+      <w:r>
+        <w:t xml:space="preserve">_t:</w:t>
       </w:r>
     </w:p>
     <w:p>
@@ -8684,13 +8762,13 @@
         <w:pStyle w:val="BodyText"/>
       </w:pPr>
       <w:r>
-        <w:t xml:space="preserve">$$g_t^P =</w:t>
-      </w:r>
-      <w:r>
-        <w:t xml:space="preserve"> </w:t>
-      </w:r>
-      <w:r>
-        <w:t xml:space="preserve">$$</w:t>
+        <w:t xml:space="preserve">_t^P =</w:t>
+      </w:r>
+      <w:r>
+        <w:t xml:space="preserve"> </w:t>
+      </w:r>
+      <w:r>
+        <w:br/>
       </w:r>
     </w:p>
     <w:p>
@@ -8698,13 +8776,13 @@
         <w:pStyle w:val="BodyText"/>
       </w:pPr>
       <w:r>
-        <w:t xml:space="preserve">$$g_t^{MB} =</w:t>
-      </w:r>
-      <w:r>
-        <w:t xml:space="preserve"> </w:t>
-      </w:r>
-      <w:r>
-        <w:t xml:space="preserve">$$</w:t>
+        <w:t xml:space="preserve">_t^{MB} =</w:t>
+      </w:r>
+      <w:r>
+        <w:t xml:space="preserve"> </w:t>
+      </w:r>
+      <w:r>
+        <w:br/>
       </w:r>
     </w:p>
     <w:p>
@@ -8712,13 +8790,13 @@
         <w:pStyle w:val="BodyText"/>
       </w:pPr>
       <w:r>
-        <w:t xml:space="preserve">$$g_t^{TO} =</w:t>
-      </w:r>
-      <w:r>
-        <w:t xml:space="preserve"> </w:t>
-      </w:r>
-      <w:r>
-        <w:t xml:space="preserve">$$</w:t>
+        <w:t xml:space="preserve">_t^{TO} =</w:t>
+      </w:r>
+      <w:r>
+        <w:t xml:space="preserve"> </w:t>
+      </w:r>
+      <w:r>
+        <w:br/>
       </w:r>
     </w:p>
     <w:p>
@@ -8726,7 +8804,13 @@
         <w:pStyle w:val="BodyText"/>
       </w:pPr>
       <w:r>
-        <w:t xml:space="preserve">(The subscript $$t-4$$ means</w:t>
+        <w:t xml:space="preserve">(The subscript</w:t>
+      </w:r>
+      <w:r>
+        <w:t xml:space="preserve"> </w:t>
+      </w:r>
+      <w:r>
+        <w:t xml:space="preserve">4 means</w:t>
       </w:r>
       <w:r>
         <w:t xml:space="preserve"> </w:t>
@@ -8756,7 +8840,10 @@
         <w:pStyle w:val="FirstParagraph"/>
       </w:pPr>
       <w:r>
-        <w:t xml:space="preserve">$$W_t = g_t^P - g_t^{MB}$$</w:t>
+        <w:t xml:space="preserve">_t = g_t^P - g_t^{MB}</w:t>
+      </w:r>
+      <w:r>
+        <w:br/>
       </w:r>
     </w:p>
     <w:p>
@@ -8777,7 +8864,13 @@
         <w:t xml:space="preserve">core diagnostic variable</w:t>
       </w:r>
       <w:r>
-        <w:t xml:space="preserve">. When $$W_t &gt; 0$$, house prices are growing faster than the mortgage stock that finances them â€” prices are</w:t>
+        <w:t xml:space="preserve">. When</w:t>
+      </w:r>
+      <w:r>
+        <w:t xml:space="preserve"> </w:t>
+      </w:r>
+      <w:r>
+        <w:t xml:space="preserve">_t &gt; 0, house prices are growing faster than the mortgage stock that finances them â€” prices are</w:t>
       </w:r>
       <w:r>
         <w:t xml:space="preserve"> </w:t>
@@ -8811,10 +8904,10 @@
         <w:pStyle w:val="FirstParagraph"/>
       </w:pPr>
       <w:r>
-        <w:t xml:space="preserve">$$</w:t>
-      </w:r>
-      <w:r>
-        <w:t xml:space="preserve">NB_t = NB_t - NB_{t-4}$$</w:t>
+        <w:t xml:space="preserve">\Delta NB_t = NB_t - NB_{t-4}</w:t>
+      </w:r>
+      <w:r>
+        <w:br/>
       </w:r>
     </w:p>
     <w:p>
@@ -8904,7 +8997,13 @@
         <w:pStyle w:val="FirstParagraph"/>
       </w:pPr>
       <w:r>
-        <w:t xml:space="preserve">For any series $$X_t$$:</w:t>
+        <w:t xml:space="preserve">For any series</w:t>
+      </w:r>
+      <w:r>
+        <w:t xml:space="preserve"> </w:t>
+      </w:r>
+      <w:r>
+        <w:t xml:space="preserve">_t:</w:t>
       </w:r>
     </w:p>
     <w:p>
@@ -8912,13 +9011,13 @@
         <w:pStyle w:val="BodyText"/>
       </w:pPr>
       <w:r>
-        <w:t xml:space="preserve">$$z(X_t) =</w:t>
-      </w:r>
-      <w:r>
-        <w:t xml:space="preserve"> </w:t>
-      </w:r>
-      <w:r>
-        <w:t xml:space="preserve">$$</w:t>
+        <w:t xml:space="preserve">(X_t) =</w:t>
+      </w:r>
+      <w:r>
+        <w:t xml:space="preserve"> </w:t>
+      </w:r>
+      <w:r>
+        <w:br/>
       </w:r>
     </w:p>
     <w:p>
@@ -8926,13 +9025,7 @@
         <w:pStyle w:val="BodyText"/>
       </w:pPr>
       <w:r>
-        <w:t xml:space="preserve">where $$</w:t>
-      </w:r>
-      <w:r>
-        <w:t xml:space="preserve">_X$$ and $$</w:t>
-      </w:r>
-      <w:r>
-        <w:t xml:space="preserve">_X$$ are computed</w:t>
+        <w:t xml:space="preserve">where \mu_X and \sigma_X are computed</w:t>
       </w:r>
       <w:r>
         <w:t xml:space="preserve"> </w:t>
@@ -8975,7 +9068,7 @@
         <w:pStyle w:val="BodyText"/>
       </w:pPr>
       <w:r>
-        <w:t xml:space="preserve">$$FAIR_t = 100</w:t>
+        <w:t xml:space="preserve">_t = 100</w:t>
       </w:r>
       <w:r>
         <w:t xml:space="preserve"> </w:t>
@@ -9008,7 +9101,10 @@
         <w:t xml:space="preserve"> </w:t>
       </w:r>
       <w:r>
-        <w:t xml:space="preserve">)$$</w:t>
+        <w:t xml:space="preserve">)</w:t>
+      </w:r>
+      <w:r>
+        <w:br/>
       </w:r>
     </w:p>
     <w:p>
@@ -9034,7 +9130,7 @@
         <w:pStyle w:val="BodyText"/>
       </w:pPr>
       <w:r>
-        <w:t xml:space="preserve">$$FAIR_t = 100</w:t>
+        <w:t xml:space="preserve">_t = 100</w:t>
       </w:r>
       <w:r>
         <w:t xml:space="preserve"> </w:t>
@@ -9058,7 +9154,10 @@
         <w:t xml:space="preserve"> </w:t>
       </w:r>
       <w:r>
-        <w:t xml:space="preserve">)$$</w:t>
+        <w:t xml:space="preserve">)</w:t>
+      </w:r>
+      <w:r>
+        <w:br/>
       </w:r>
     </w:p>
     <w:bookmarkEnd w:id="154"/>
@@ -9076,10 +9175,10 @@
         <w:pStyle w:val="FirstParagraph"/>
       </w:pPr>
       <w:r>
-        <w:t xml:space="preserve">$$</w:t>
-      </w:r>
-      <w:r>
-        <w:t xml:space="preserve">FAIR_t = FAIR_t - FAIR_{t-1}$$</w:t>
+        <w:t xml:space="preserve">\Delta FAIR_t = FAIR_t - FAIR_{t-1}</w:t>
+      </w:r>
+      <w:r>
+        <w:br/>
       </w:r>
     </w:p>
     <w:p>
@@ -9154,13 +9253,7 @@
               <w:pStyle w:val="Compact"/>
             </w:pPr>
             <w:r>
-              <w:t xml:space="preserve">$$FAIR</w:t>
-            </w:r>
-            <w:r>
-              <w:t xml:space="preserve"> </w:t>
-            </w:r>
-            <w:r>
-              <w:t xml:space="preserve">$$</w:t>
+              <w:t xml:space="preserve">\</w:t>
             </w:r>
           </w:p>
         </w:tc>
@@ -9184,13 +9277,13 @@
               <w:pStyle w:val="Compact"/>
             </w:pPr>
             <w:r>
-              <w:t xml:space="preserve">$$20</w:t>
+              <w:t xml:space="preserve">\20</w:t>
             </w:r>
             <w:r>
               <w:t xml:space="preserve"> </w:t>
             </w:r>
             <w:r>
-              <w:t xml:space="preserve">FAIR &lt; 50$$</w:t>
+              <w:t xml:space="preserve">FAIR &lt; 50\</w:t>
             </w:r>
           </w:p>
         </w:tc>
@@ -9214,13 +9307,13 @@
               <w:pStyle w:val="Compact"/>
             </w:pPr>
             <w:r>
-              <w:t xml:space="preserve">$$-20</w:t>
+              <w:t xml:space="preserve">-20</w:t>
             </w:r>
             <w:r>
               <w:t xml:space="preserve"> </w:t>
             </w:r>
             <w:r>
-              <w:t xml:space="preserve">FAIR &lt; 20$$</w:t>
+              <w:t xml:space="preserve">FAIR &lt; 20\</w:t>
             </w:r>
           </w:p>
         </w:tc>
@@ -9244,13 +9337,13 @@
               <w:pStyle w:val="Compact"/>
             </w:pPr>
             <w:r>
-              <w:t xml:space="preserve">$$-50</w:t>
+              <w:t xml:space="preserve">-50</w:t>
             </w:r>
             <w:r>
               <w:t xml:space="preserve"> </w:t>
             </w:r>
             <w:r>
-              <w:t xml:space="preserve">FAIR &lt; -20$$</w:t>
+              <w:t xml:space="preserve">FAIR &lt; -20\</w:t>
             </w:r>
           </w:p>
         </w:tc>
@@ -9274,7 +9367,7 @@
               <w:pStyle w:val="Compact"/>
             </w:pPr>
             <w:r>
-              <w:t xml:space="preserve">$$FAIR &lt; -50$$</w:t>
+              <w:t xml:space="preserve">&lt; -50\</w:t>
             </w:r>
           </w:p>
         </w:tc>
@@ -9338,7 +9431,25 @@
         <w:t xml:space="preserve"> </w:t>
       </w:r>
       <w:r>
-        <w:t xml:space="preserve">is defined algorithmically as: - A local price peak followed by a drawdown of at least $$X\$$ within $$Y$$ quarters - With a minimum cooldown of $$C$$ quarters between events</w:t>
+        <w:t xml:space="preserve">is defined algorithmically as: - A local price peak followed by a drawdown of at least</w:t>
+      </w:r>
+      <w:r>
+        <w:t xml:space="preserve"> </w:t>
+      </w:r>
+      <w:r>
+        <w:t xml:space="preserve">\ within</w:t>
+      </w:r>
+      <w:r>
+        <w:t xml:space="preserve"> </w:t>
+      </w:r>
+      <w:r>
+        <w:t xml:space="preserve"> quarters - With a minimum cooldown of</w:t>
+      </w:r>
+      <w:r>
+        <w:t xml:space="preserve"> </w:t>
+      </w:r>
+      <w:r>
+        <w:t xml:space="preserve"> quarters between events</w:t>
       </w:r>
     </w:p>
     <w:bookmarkEnd w:id="158"/>
@@ -9432,7 +9543,7 @@
               <w:pStyle w:val="Compact"/>
             </w:pPr>
             <w:r>
-              <w:t xml:space="preserve">$$FAIR &gt; 20$$ for 2 consecutive quarters</w:t>
+              <w:t xml:space="preserve">&gt; 20 for 2 consecutive quarters</w:t>
             </w:r>
           </w:p>
         </w:tc>
@@ -9467,10 +9578,7 @@
               <w:pStyle w:val="Compact"/>
             </w:pPr>
             <w:r>
-              <w:t xml:space="preserve">$$</w:t>
-            </w:r>
-            <w:r>
-              <w:t xml:space="preserve">FAIR &gt; 5$$ for 2 consecutive quarters</w:t>
+              <w:t xml:space="preserve">\Delta FAIR &gt; 5 for 2 consecutive quarters</w:t>
             </w:r>
           </w:p>
         </w:tc>
@@ -9505,16 +9613,13 @@
               <w:pStyle w:val="Compact"/>
             </w:pPr>
             <w:r>
-              <w:t xml:space="preserve">$$FAIR &gt; 0$$ and $$</w:t>
-            </w:r>
-            <w:r>
-              <w:t xml:space="preserve">FAIR</w:t>
+              <w:t xml:space="preserve">&gt; 0 and \Delta FAIR</w:t>
             </w:r>
             <w:r>
               <w:t xml:space="preserve"> </w:t>
             </w:r>
             <w:r>
-              <w:t xml:space="preserve">$$</w:t>
+              <w:t xml:space="preserve">\</w:t>
             </w:r>
           </w:p>
         </w:tc>
@@ -10358,7 +10463,10 @@
         <w:pStyle w:val="BodyText"/>
       </w:pPr>
       <w:r>
-        <w:t xml:space="preserve">$$ g_t^P = YoY(P_t) $$</w:t>
+        <w:t xml:space="preserve"> g_t^P = YoY(P_t)</w:t>
+      </w:r>
+      <w:r>
+        <w:br/>
       </w:r>
     </w:p>
     <w:p>
@@ -10366,7 +10474,10 @@
         <w:pStyle w:val="BodyText"/>
       </w:pPr>
       <w:r>
-        <w:t xml:space="preserve">$$ g_t^{MB} = YoY(MB_t) $$</w:t>
+        <w:t xml:space="preserve"> g_t^{MB} = YoY(MB_t)</w:t>
+      </w:r>
+      <w:r>
+        <w:br/>
       </w:r>
     </w:p>
     <w:p>
@@ -10374,7 +10485,10 @@
         <w:pStyle w:val="BodyText"/>
       </w:pPr>
       <w:r>
-        <w:t xml:space="preserve">$$ g_t^{TO} = YoY(TO_t) $$</w:t>
+        <w:t xml:space="preserve"> g_t^{TO} = YoY(TO_t)</w:t>
+      </w:r>
+      <w:r>
+        <w:br/>
       </w:r>
     </w:p>
     <w:p>
@@ -10390,7 +10504,10 @@
         <w:pStyle w:val="BodyText"/>
       </w:pPr>
       <w:r>
-        <w:t xml:space="preserve">$$ W_t = g_t^P - g_t^{MB} $$</w:t>
+        <w:t xml:space="preserve"> W_t = g_t^P - g_t^{MB}</w:t>
+      </w:r>
+      <w:r>
+        <w:br/>
       </w:r>
     </w:p>
     <w:p>
@@ -10406,13 +10523,13 @@
         <w:pStyle w:val="BodyText"/>
       </w:pPr>
       <w:r>
-        <w:t xml:space="preserve">$$</w:t>
-      </w:r>
-      <w:r>
-        <w:t xml:space="preserve"> </w:t>
-      </w:r>
-      <w:r>
-        <w:t xml:space="preserve">NB_t = NB_t - NB_{t-4} $$</w:t>
+        <w:t xml:space="preserve"> </w:t>
+      </w:r>
+      <w:r>
+        <w:t xml:space="preserve">NB_t = NB_t - NB_{t-4}</w:t>
+      </w:r>
+      <w:r>
+        <w:br/>
       </w:r>
     </w:p>
     <w:bookmarkEnd w:id="171"/>
@@ -10503,16 +10620,13 @@
         <w:pStyle w:val="BodyText"/>
       </w:pPr>
       <w:r>
-        <w:t xml:space="preserve">$$ z(X_t) =</w:t>
-      </w:r>
-      <w:r>
-        <w:t xml:space="preserve"> </w:t>
-      </w:r>
-      <w:r>
-        <w:t xml:space="preserve"> </w:t>
-      </w:r>
-      <w:r>
-        <w:t xml:space="preserve">$$</w:t>
+        <w:t xml:space="preserve"> z(X_t) =</w:t>
+      </w:r>
+      <w:r>
+        <w:t xml:space="preserve"> </w:t>
+      </w:r>
+      <w:r>
+        <w:br/>
       </w:r>
     </w:p>
     <w:p>
@@ -10520,13 +10634,7 @@
         <w:pStyle w:val="BodyText"/>
       </w:pPr>
       <w:r>
-        <w:t xml:space="preserve">where $$</w:t>
-      </w:r>
-      <w:r>
-        <w:t xml:space="preserve">_X$$ and $$</w:t>
-      </w:r>
-      <w:r>
-        <w:t xml:space="preserve">_X$$ are computed using baseline quarters only.</w:t>
+        <w:t xml:space="preserve">where \mu_X and \sigma_X are computed using baseline quarters only.</w:t>
       </w:r>
     </w:p>
     <w:bookmarkEnd w:id="173"/>
@@ -10561,7 +10669,7 @@
         <w:pStyle w:val="BodyText"/>
       </w:pPr>
       <w:r>
-        <w:t xml:space="preserve">$$ FAIR_t = 100</w:t>
+        <w:t xml:space="preserve"> FAIR_t = 100</w:t>
       </w:r>
       <w:r>
         <w:t xml:space="preserve"> </w:t>
@@ -10594,7 +10702,10 @@
         <w:t xml:space="preserve"> </w:t>
       </w:r>
       <w:r>
-        <w:t xml:space="preserve">) $$</w:t>
+        <w:t xml:space="preserve">)</w:t>
+      </w:r>
+      <w:r>
+        <w:br/>
       </w:r>
     </w:p>
     <w:p>
@@ -10610,7 +10721,7 @@
         <w:pStyle w:val="BodyText"/>
       </w:pPr>
       <w:r>
-        <w:t xml:space="preserve">$$ FAIR_t = 100</w:t>
+        <w:t xml:space="preserve"> FAIR_t = 100</w:t>
       </w:r>
       <w:r>
         <w:t xml:space="preserve"> </w:t>
@@ -10634,7 +10745,10 @@
         <w:t xml:space="preserve"> </w:t>
       </w:r>
       <w:r>
-        <w:t xml:space="preserve">) $$</w:t>
+        <w:t xml:space="preserve">)</w:t>
+      </w:r>
+      <w:r>
+        <w:br/>
       </w:r>
     </w:p>
     <w:bookmarkEnd w:id="174"/>
@@ -10660,13 +10774,13 @@
         <w:pStyle w:val="BodyText"/>
       </w:pPr>
       <w:r>
-        <w:t xml:space="preserve">$$</w:t>
-      </w:r>
-      <w:r>
-        <w:t xml:space="preserve"> </w:t>
-      </w:r>
-      <w:r>
-        <w:t xml:space="preserve">FAIR_t = FAIR_t - FAIR_{t-1} $$</w:t>
+        <w:t xml:space="preserve"> </w:t>
+      </w:r>
+      <w:r>
+        <w:t xml:space="preserve">FAIR_t = FAIR_t - FAIR_{t-1}</w:t>
+      </w:r>
+      <w:r>
+        <w:br/>
       </w:r>
     </w:p>
     <w:p>
@@ -10704,13 +10818,7 @@
         </w:numPr>
       </w:pPr>
       <w:r>
-        <w:t xml:space="preserve">$$FAIR</w:t>
-      </w:r>
-      <w:r>
-        <w:t xml:space="preserve"> </w:t>
-      </w:r>
-      <w:r>
-        <w:t xml:space="preserve">$$: strong deterioration regime risk</w:t>
+        <w:t xml:space="preserve">: strong deterioration regime risk</w:t>
       </w:r>
     </w:p>
     <w:p>
@@ -10722,13 +10830,13 @@
         </w:numPr>
       </w:pPr>
       <w:r>
-        <w:t xml:space="preserve">$$20</w:t>
-      </w:r>
-      <w:r>
-        <w:t xml:space="preserve"> </w:t>
-      </w:r>
-      <w:r>
-        <w:t xml:space="preserve">FAIR &lt; 50$$: mild deterioration bias</w:t>
+        <w:t xml:space="preserve">\20</w:t>
+      </w:r>
+      <w:r>
+        <w:t xml:space="preserve"> </w:t>
+      </w:r>
+      <w:r>
+        <w:t xml:space="preserve">FAIR &lt; 50: mild deterioration bias</w:t>
       </w:r>
     </w:p>
     <w:p>
@@ -10740,13 +10848,13 @@
         </w:numPr>
       </w:pPr>
       <w:r>
-        <w:t xml:space="preserve">$$-20</w:t>
-      </w:r>
-      <w:r>
-        <w:t xml:space="preserve"> </w:t>
-      </w:r>
-      <w:r>
-        <w:t xml:space="preserve">FAIR &lt; 20$$: neutral/noisy</w:t>
+        <w:t xml:space="preserve">-20</w:t>
+      </w:r>
+      <w:r>
+        <w:t xml:space="preserve"> </w:t>
+      </w:r>
+      <w:r>
+        <w:t xml:space="preserve">FAIR &lt; 20: neutral/noisy</w:t>
       </w:r>
     </w:p>
     <w:p>
@@ -10758,13 +10866,13 @@
         </w:numPr>
       </w:pPr>
       <w:r>
-        <w:t xml:space="preserve">$$-50</w:t>
-      </w:r>
-      <w:r>
-        <w:t xml:space="preserve"> </w:t>
-      </w:r>
-      <w:r>
-        <w:t xml:space="preserve">FAIR &lt; -20$$: mild improvement bias</w:t>
+        <w:t xml:space="preserve">-50</w:t>
+      </w:r>
+      <w:r>
+        <w:t xml:space="preserve"> </w:t>
+      </w:r>
+      <w:r>
+        <w:t xml:space="preserve">FAIR &lt; -20: mild improvement bias</w:t>
       </w:r>
     </w:p>
     <w:p>
@@ -10776,7 +10884,7 @@
         </w:numPr>
       </w:pPr>
       <w:r>
-        <w:t xml:space="preserve">$$FAIR &lt; -50$$: strong improvement regime (often stress-driven)</w:t>
+        <w:t xml:space="preserve">&lt; -50: strong improvement regime (often stress-driven)</w:t>
       </w:r>
     </w:p>
     <w:bookmarkEnd w:id="176"/>
@@ -10812,7 +10920,25 @@
         <w:pStyle w:val="FirstParagraph"/>
       </w:pPr>
       <w:r>
-        <w:t xml:space="preserve">A â€œcrash startâ€ may be defined as a local price peak followed by a drawdown of at least $$X\$$ within $$Y$$ quarters, with a minimum separation (cooldown) of $$C$$ quarters to avoid double-counting clustered peaks.</w:t>
+        <w:t xml:space="preserve">A â€œcrash startâ€ may be defined as a local price peak followed by a drawdown of at least</w:t>
+      </w:r>
+      <w:r>
+        <w:t xml:space="preserve"> </w:t>
+      </w:r>
+      <w:r>
+        <w:t xml:space="preserve">\ within</w:t>
+      </w:r>
+      <w:r>
+        <w:t xml:space="preserve"> </w:t>
+      </w:r>
+      <w:r>
+        <w:t xml:space="preserve"> quarters, with a minimum separation (cooldown) of</w:t>
+      </w:r>
+      <w:r>
+        <w:t xml:space="preserve"> </w:t>
+      </w:r>
+      <w:r>
+        <w:t xml:space="preserve"> quarters to avoid double-counting clustered peaks.</w:t>
       </w:r>
     </w:p>
     <w:bookmarkEnd w:id="178"/>
@@ -10842,7 +10968,13 @@
         </w:numPr>
       </w:pPr>
       <w:r>
-        <w:t xml:space="preserve">A: sustained level stress: $$FAIR &gt; 20$$ for 2 quarters</w:t>
+        <w:t xml:space="preserve">A: sustained level stress:</w:t>
+      </w:r>
+      <w:r>
+        <w:t xml:space="preserve"> </w:t>
+      </w:r>
+      <w:r>
+        <w:t xml:space="preserve">&gt; 20 for 2 quarters</w:t>
       </w:r>
     </w:p>
     <w:p>
@@ -10854,10 +10986,7 @@
         </w:numPr>
       </w:pPr>
       <w:r>
-        <w:t xml:space="preserve">B: sustained acceleration: $$</w:t>
-      </w:r>
-      <w:r>
-        <w:t xml:space="preserve">FAIR &gt; 5$$ for 2 quarters</w:t>
+        <w:t xml:space="preserve">B: sustained acceleration: \Delta FAIR &gt; 5 for 2 quarters</w:t>
       </w:r>
     </w:p>
     <w:p>
@@ -10869,16 +10998,19 @@
         </w:numPr>
       </w:pPr>
       <w:r>
-        <w:t xml:space="preserve">C: broad stress-worsening: $$FAIR &gt; 0$$ and $$</w:t>
-      </w:r>
-      <w:r>
-        <w:t xml:space="preserve">FAIR</w:t>
-      </w:r>
-      <w:r>
-        <w:t xml:space="preserve"> </w:t>
-      </w:r>
-      <w:r>
-        <w:t xml:space="preserve">$$</w:t>
+        <w:t xml:space="preserve">C: broad stress-worsening:</w:t>
+      </w:r>
+      <w:r>
+        <w:t xml:space="preserve"> </w:t>
+      </w:r>
+      <w:r>
+        <w:t xml:space="preserve">&gt; 0 and \Delta FAIR</w:t>
+      </w:r>
+      <w:r>
+        <w:t xml:space="preserve"> </w:t>
+      </w:r>
+      <w:r>
+        <w:br/>
       </w:r>
     </w:p>
     <w:bookmarkEnd w:id="179"/>
@@ -10967,10 +11099,7 @@
         </w:numPr>
       </w:pPr>
       <w:r>
-        <w:t xml:space="preserve">an animated direction-of-flow GIF emphasising $$</w:t>
-      </w:r>
-      <w:r>
-        <w:t xml:space="preserve">FAIR_t$$,</w:t>
+        <w:t xml:space="preserve">an animated direction-of-flow GIF emphasising \Delta FAIR_t,</w:t>
       </w:r>
     </w:p>
     <w:p>

</xml_diff>